<commit_message>
style(slides,script): remove explicit grading point tags, enlarge font sizes, streamline bullet text, and integrate realistic terminal console logs
</commit_message>
<xml_diff>
--- a/docs/Kich_Ban_Thuyet_Trinh_5_Phut_DT005.docx
+++ b/docs/Kich_Ban_Thuyet_Trinh_5_Phut_DT005.docx
@@ -50,41 +50,27 @@
         <w:t>5 phút (300 giây)</w:t>
       </w:r>
       <w:r>
-        <w:t>. Kịch bản này được tối ưu từng câu chữ để bạn nói với tốc độ vừa phải (~120 từ/phút), dõng dạc, tự tin và không bị cháy giáo án.</w:t>
+        <w:t>. Kịch bản này được tối ưu từng câu chữ để bạn nói với tốc độ vừa phải (~120 từ/phút), dõng dạc, tự tin, không bị cháy giáo án.</w:t>
         <w:br/>
       </w:r>
       <w:r>
-        <w:t>• Cấu trúc slide giữ trọn vẹn toàn bộ các khối kiến thức học thuật theo đúng yêu cầu đánh giá của Giảng viên:</w:t>
+        <w:t>• Cấu trúc slide và lời thoại thể hiện sự chuyên nghiệp của một buổi bảo vệ đồ án khoa học:</w:t>
         <w:br/>
       </w:r>
       <w:r>
-        <w:t xml:space="preserve">   + </w:t>
-      </w:r>
-      <w:r>
-        <w:rPr>
-          <w:b/>
-        </w:rPr>
-        <w:t>Thang điểm [6-8]</w:t>
-      </w:r>
-      <w:r>
-        <w:t>: Dịch toàn văn bài báo khoa học Harry Halpin (Oxford 2025), hiện thực hóa và chạy lại 3 mô hình nền tảng đối chứng.</w:t>
+        <w:t xml:space="preserve">   + Hoàn thành trọn vẹn việc dịch toàn văn bài báo Harry Halpin Oxford 2025 và tái lập 3 mô hình nền tảng đối chứng.</w:t>
         <w:br/>
       </w:r>
       <w:r>
-        <w:t xml:space="preserve">   + </w:t>
-      </w:r>
-      <w:r>
-        <w:rPr>
-          <w:b/>
-        </w:rPr>
-        <w:t>Thang điểm [9, 10]</w:t>
-      </w:r>
-      <w:r>
-        <w:t>: Tự thiết kế mô hình HD-Merkle Tree, thuật toán Dirty-Path Update O(log N), kiểm chứng trên 2 tập dữ liệu Kaggle (1.115 &amp; 5.600 tệp), vượt qua 100% 7 Security Games và 17/17 Unit Tests.</w:t>
+        <w:t xml:space="preserve">   + Tự thiết kế mô hình HD-Merkle Tree và thuật toán Dirty-Path Update O(log N), chứng minh hiệu năng cập nhật nhanh hơn 458 - 748 lần, tiết kiệm 98.8% băng thông.</w:t>
         <w:br/>
       </w:r>
       <w:r>
-        <w:t xml:space="preserve">• Toàn bộ các slide chụp kết quả web tĩnh đã được thay thế bằng </w:t>
+        <w:t xml:space="preserve">   + Vượt qua 100% 7 Security Games hình thức và 17/17 Unit Tests tự động trên 2 tập dữ liệu Kaggle thực tế (1.115 &amp; 5.600 tệp).</w:t>
+        <w:br/>
+      </w:r>
+      <w:r>
+        <w:t xml:space="preserve">• Toàn bộ các ảnh chụp web tĩnh đã được thay thế bằng </w:t>
       </w:r>
       <w:r>
         <w:rPr>
@@ -93,7 +79,7 @@
         <w:t>SLIDE 15: LIVE DEMONSTRATION</w:t>
       </w:r>
       <w:r>
-        <w:t xml:space="preserve"> để bạn trình diễn thực tế trực tiếp trên Trình duyệt và Streaming Terminal Logs.</w:t>
+        <w:t xml:space="preserve"> để bạn trình diễn thực tế trực tiếp trên Trình duyệt Web và Streaming Terminal Logs.</w:t>
         <w:br/>
       </w:r>
       <w:r>
@@ -261,7 +247,7 @@
               <w:rPr>
                 <w:sz w:val="18"/>
               </w:rPr>
-              <w:t>Trang tiêu đề đề tài DT005 &amp; Mục tiêu điểm [6-8], [9,10]</w:t>
+              <w:t>Trang tiêu đề đề tài DT005 &amp; Mục tiêu khoa học hệ thống</w:t>
             </w:r>
           </w:p>
         </w:tc>
@@ -352,7 +338,7 @@
               <w:rPr>
                 <w:sz w:val="18"/>
               </w:rPr>
-              <w:t>Giới thiệu &amp; Tóm tắt bài báo Harry Halpin (Oxford 2025) [6-8]</w:t>
+              <w:t>Giới thiệu &amp; Tóm tắt bài báo Harry Halpin (Oxford 2025)</w:t>
             </w:r>
           </w:p>
         </w:tc>
@@ -443,7 +429,7 @@
               <w:rPr>
                 <w:sz w:val="18"/>
               </w:rPr>
-              <w:t>Hiện thực hóa &amp; Chạy lại 3 mô hình nền tảng bài báo [6-8]</w:t>
+              <w:t>Hiện thực hóa &amp; Chạy lại 3 mô hình nền tảng bài báo</w:t>
             </w:r>
           </w:p>
         </w:tc>
@@ -534,7 +520,7 @@
               <w:rPr>
                 <w:sz w:val="18"/>
               </w:rPr>
-              <w:t>Phân tích 4 hạn chế bài báo gốc &amp; Động lực cải tiến [9, 10]</w:t>
+              <w:t>Phân tích 4 nút thắt kỹ thuật của mô hình nền tảng</w:t>
             </w:r>
           </w:p>
         </w:tc>
@@ -625,7 +611,7 @@
               <w:rPr>
                 <w:sz w:val="18"/>
               </w:rPr>
-              <w:t>Đề xuất mô hình mới: Cây Merkle phân cấp động (HD-Merkle) [9, 10]</w:t>
+              <w:t>Đề xuất mô hình mới: Cây Merkle phân cấp động (HD-Merkle Tree)</w:t>
             </w:r>
           </w:p>
         </w:tc>
@@ -716,7 +702,7 @@
               <w:rPr>
                 <w:sz w:val="18"/>
               </w:rPr>
-              <w:t>Thuật toán đề xuất: Cập nhật động theo đường dẫn bẩn (Dirty-Path) [9, 10]</w:t>
+              <w:t>Thuật toán đề xuất: Cập nhật động theo đường dẫn bẩn (Dirty-Path)</w:t>
             </w:r>
           </w:p>
         </w:tc>
@@ -807,7 +793,7 @@
               <w:rPr>
                 <w:sz w:val="18"/>
               </w:rPr>
-              <w:t>Cơ chế an ninh mật mã &amp; Chuẩn phân tách miền RFC 6962 [9, 10]</w:t>
+              <w:t>Cơ chế an ninh mật mã &amp; Chuẩn phân tách miền RFC 6962</w:t>
             </w:r>
           </w:p>
         </w:tc>
@@ -898,7 +884,7 @@
               <w:rPr>
                 <w:sz w:val="18"/>
               </w:rPr>
-              <w:t>Phòng chống tấn công kênh kề đo thời gian &amp; Xóa sạch bộ nhớ [9, 10]</w:t>
+              <w:t>Phòng chống tấn công kênh kề đo thời gian &amp; Xóa sạch bộ nhớ</w:t>
             </w:r>
           </w:p>
         </w:tc>
@@ -989,7 +975,7 @@
               <w:rPr>
                 <w:sz w:val="18"/>
               </w:rPr>
-              <w:t>Thiết kế 2 tập dữ liệu Kaggle thực tế (1.115 &amp; 5.600 tệp) [9, 10]</w:t>
+              <w:t>Thiết kế 2 tập dữ liệu Kaggle thực tế (1.115 &amp; 5.600 tệp tin)</w:t>
             </w:r>
           </w:p>
         </w:tc>
@@ -1080,7 +1066,7 @@
               <w:rPr>
                 <w:sz w:val="18"/>
               </w:rPr>
-              <w:t>Bảng đối sánh Big-O lý thuyết &amp; Cập nhật động nhanh hơn 458-748 lần</w:t>
+              <w:t>Bảng đối sánh Big-O lý thuyết &amp; Thực nghiệm cập nhật nhanh 458-748x</w:t>
             </w:r>
           </w:p>
         </w:tc>
@@ -1171,7 +1157,7 @@
               <w:rPr>
                 <w:sz w:val="18"/>
               </w:rPr>
-              <w:t>Khung 7 Trò chơi an ninh mật mã học: Games 1 – 4 [Toán học]</w:t>
+              <w:t>Khung 7 Trò chơi an ninh mật mã học: Games 1 – 4</w:t>
             </w:r>
           </w:p>
         </w:tc>
@@ -1262,7 +1248,7 @@
               <w:rPr>
                 <w:sz w:val="18"/>
               </w:rPr>
-              <w:t>Khung 7 Trò chơi an ninh mật mã học: Games 5 – 7 &amp; Bảng tổng kết</w:t>
+              <w:t>Khung 7 Trò chơi an ninh mật mã học: Games 5 – 7 &amp; Tổng kết</w:t>
             </w:r>
           </w:p>
         </w:tc>
@@ -1634,7 +1620,7 @@
               <w:rPr>
                 <w:sz w:val="18"/>
               </w:rPr>
-              <w:t>Tổng kết đóng góp khoa học &amp; Khẳng định kết quả vượt trội [9, 10]</w:t>
+              <w:t>Tổng kết đóng góp khoa học &amp; Khẳng định kết quả vượt trội</w:t>
             </w:r>
           </w:p>
         </w:tc>
@@ -1832,7 +1818,7 @@
           <w:color w:val="0F172A"/>
           <w:sz w:val="21"/>
         </w:rPr>
-        <w:t>“Kính thưa Thầy và Hội đồng đánh giá, em tên là Võ Anh Kiệt. Hôm nay em xin báo cáo đồ án giữa kỳ đề tài DT005: Hệ thống kiểm tra toàn vẹn tệp bằng SHA-256, HMAC và Cây Merkle phân cấp HD-Merkle Tree. Đồ án bám sát 2 mục tiêu đánh giá: Dịch toàn văn bài báo khoa học Harry Halpin Oxford 2025 và chạy lại 3 mô hình nền tảng đạt thang điểm 6-8; đồng thời tự thiết kế mô hình mới, thuật toán mới đạt kết quả thực nghiệm vượt trội đáp ứng thang điểm 9-10.”</w:t>
+        <w:t>“Kính thưa Thầy và Hội đồng đánh giá, em tên là Võ Anh Kiệt. Hôm nay em xin báo cáo đồ án giữa kỳ đề tài DT005: Hệ thống kiểm tra toàn vẹn tệp bằng SHA-256, HMAC và Cây Merkle phân cấp HD-Merkle Tree. Đồ án tập trung nghiên cứu bài toán đối kháng trong bài báo khoa học Oxford 2025 của Harry Halpin, tái lập 3 mô hình nền tảng đối chứng, đồng thời tự thiết kế kiến trúc phân cấp mới và thuật toán cập nhật động đạt hiệu năng và độ an toàn mật mã vượt trội.”</w:t>
       </w:r>
     </w:p>
     <w:p>
@@ -1852,7 +1838,7 @@
         <w:rPr>
           <w:sz w:val="19"/>
         </w:rPr>
-        <w:t>Nói rõ họ tên, MSSV, tên đề tài và 2 thang điểm đánh giá để gây ấn tượng ngay từ đầu.</w:t>
+        <w:t>Nói rõ ràng họ tên, MSSV, tên đề tài và mục tiêu khoa học tổng quát.</w:t>
       </w:r>
     </w:p>
     <w:p>
@@ -1889,7 +1875,7 @@
           <w:color w:val="2563EB"/>
           <w:sz w:val="19"/>
         </w:rPr>
-        <w:t>Phân loại: Thang điểm [6-8]   |   Thời lượng: 15 giây</w:t>
+        <w:t>Phân loại: Cơ sở lý thuyết   |   Thời lượng: 15 giây</w:t>
       </w:r>
     </w:p>
     <w:p>
@@ -1916,7 +1902,7 @@
           <w:color w:val="0F172A"/>
           <w:sz w:val="21"/>
         </w:rPr>
-        <w:t>“Đầu tiên, em đã dịch thuật học thuật toàn văn bài báo 'The Adversary: The Philosophy of Cryptography' của tác giả Harry Halpin, xuất bản trên Oxford Journal of Cybersecurity năm 2025. Bài báo đặt ra luận điểm cốt lõi: Mật mã học không phải bài toán tĩnh, mà là cuộc đối đầu có chủ đích giữa Kẻ phòng thủ và 4 mô hình Kẻ thù hình thức: Kẻ nghe lén thụ động, Kẻ tấn công đường truyền Dolev-Yao, Kẻ thù tính toán PPT và Kẻ thù khai thác kênh kề siêu dữ liệu.”</w:t>
+        <w:t>“Đầu tiên, em đã dịch thuật học thuật toàn văn bài báo 'The Adversary: The Philosophy of Cryptography' của tác giả Harry Halpin, xuất bản trên Oxford Journal of Cybersecurity năm 2025. Bài báo đặt ra luận điểm cốt lõi: Mật mã học không phải bài toán tĩnh, mà là cuộc đối đầu có chủ đích giữa Kẻ phòng thủ và 4 mô hình Kẻ thù hình thức: Kẻ nghe lén thụ động, Kẻ tấn công đường truyền Dolev-Yao, Kẻ thù tính toán PPT và Kẻ thù khai thác kênh kề siêu dữ liệu. Bài báo thuần lý thuyết, tạo động lực thực nghiệm cho đồ án của em.”</w:t>
       </w:r>
     </w:p>
     <w:p>
@@ -1973,7 +1959,7 @@
           <w:color w:val="2563EB"/>
           <w:sz w:val="19"/>
         </w:rPr>
-        <w:t>Phân loại: Thang điểm [6-8]   |   Thời lượng: 15 giây</w:t>
+        <w:t>Phân loại: Hiện thực hóa bài báo   |   Thời lượng: 15 giây</w:t>
       </w:r>
     </w:p>
     <w:p>
@@ -2000,7 +1986,7 @@
           <w:color w:val="0F172A"/>
           <w:sz w:val="21"/>
         </w:rPr>
-        <w:t>“Để giải quyết khoảng trống thực nghiệm của bài báo gốc, em đã hiện thực hóa và chạy lại 3 mô hình nền tảng: Thứ nhất là Danh sách băm phẳng SHA-256; Thứ hai là Danh sách băm có khóa HMAC; và Thứ ba là Cây Merkle chuẩn của Ralph Merkle 1979. Cả 3 mô hình đều phát hiện 100% sai lệch khi tệp bị sửa đổi, hoàn thành trọn vẹn yêu cầu tái lập kết quả nền tảng ở thang điểm 6 đến 8.”</w:t>
+        <w:t>“Để giải quyết khoảng trống thực nghiệm của bài báo gốc, em đã hiện thực hóa và chạy lại 3 mô hình nền tảng đối chứng: Thứ nhất là Danh sách băm phẳng SHA-256; Thứ hai là Danh sách băm có khóa HMAC-SHA256; và Thứ ba là Cây Merkle chuẩn của Ralph Merkle 1979. Cả 3 mô hình đều phát hiện 100% sai lệch khi tệp bị sửa đổi, hoàn thành trọn vẹn yêu cầu tái lập kết quả bài báo khoa học gốc.”</w:t>
       </w:r>
     </w:p>
     <w:p>
@@ -2020,7 +2006,7 @@
         <w:rPr>
           <w:sz w:val="19"/>
         </w:rPr>
-        <w:t>Khẳng định đã hoàn thành 100% yêu cầu tái lập kết quả bài báo gốc.</w:t>
+        <w:t>Khẳng định đã tái lập thành công 100% mô hình của bài báo khoa học gốc.</w:t>
       </w:r>
     </w:p>
     <w:p>
@@ -2077,7 +2063,7 @@
           <w:color w:val="2563EB"/>
           <w:sz w:val="19"/>
         </w:rPr>
-        <w:t>Phân loại: Mục tiêu đạt [9, 10]   |   Thời lượng: 15 giây</w:t>
+        <w:t>Phân loại: Phân tích hạn chế   |   Thời lượng: 15 giây</w:t>
       </w:r>
     </w:p>
     <w:p>
@@ -2124,7 +2110,7 @@
         <w:rPr>
           <w:sz w:val="19"/>
         </w:rPr>
-        <w:t>Đây là cơ sở khoa học để đề xuất mô hình mới đạt điểm 9, 10.</w:t>
+        <w:t>Đây là cơ sở khoa học để đề xuất mô hình mới đạt hiệu năng vượt trội.</w:t>
       </w:r>
     </w:p>
     <w:p>
@@ -2181,7 +2167,7 @@
           <w:color w:val="2563EB"/>
           <w:sz w:val="19"/>
         </w:rPr>
-        <w:t>Phân loại: Trọng tâm đạt [9, 10]   |   Thời lượng: 15 giây</w:t>
+        <w:t>Phân loại: Kiến trúc đề xuất   |   Thời lượng: 15 giây</w:t>
       </w:r>
     </w:p>
     <w:p>
@@ -2285,7 +2271,7 @@
           <w:color w:val="2563EB"/>
           <w:sz w:val="19"/>
         </w:rPr>
-        <w:t>Phân loại: Trọng tâm đạt [9, 10]   |   Thời lượng: 15 giây</w:t>
+        <w:t>Phân loại: Giải thuật đề xuất   |   Thời lượng: 15 giây</w:t>
       </w:r>
     </w:p>
     <w:p>
@@ -2369,7 +2355,7 @@
           <w:color w:val="2563EB"/>
           <w:sz w:val="19"/>
         </w:rPr>
-        <w:t>Phân loại: Trọng tâm đạt [9, 10]   |   Thời lượng: 15 giây</w:t>
+        <w:t>Phân loại: Cơ chế an ninh   |   Thời lượng: 15 giây</w:t>
       </w:r>
     </w:p>
     <w:p>
@@ -2473,7 +2459,7 @@
           <w:color w:val="2563EB"/>
           <w:sz w:val="19"/>
         </w:rPr>
-        <w:t>Phân loại: Trọng tâm đạt [9, 10]   |   Thời lượng: 15 giây</w:t>
+        <w:t>Phân loại: Phòng chống nâng cao   |   Thời lượng: 15 giây</w:t>
       </w:r>
     </w:p>
     <w:p>
@@ -2557,7 +2543,7 @@
           <w:color w:val="2563EB"/>
           <w:sz w:val="19"/>
         </w:rPr>
-        <w:t>Phân loại: Thang điểm [9, 10]   |   Thời lượng: 15 giây</w:t>
+        <w:t>Phân loại: Thực nghiệm   |   Thời lượng: 15 giây</w:t>
       </w:r>
     </w:p>
     <w:p>
@@ -2661,7 +2647,7 @@
           <w:color w:val="2563EB"/>
           <w:sz w:val="19"/>
         </w:rPr>
-        <w:t>Phân loại: Thang điểm [9, 10]   |   Thời lượng: 20 giây</w:t>
+        <w:t>Phân loại: Đối chuẩn hiệu năng   |   Thời lượng: 20 giây</w:t>
       </w:r>
     </w:p>
     <w:p>
@@ -2688,7 +2674,7 @@
           <w:color w:val="0F172A"/>
           <w:sz w:val="21"/>
         </w:rPr>
-        <w:t>“Bảng đối sánh Big-O chứng minh ưu thế lý thuyết: Cả 3 mô hình cũ đều có chi phí cập nhật O(N), trong khi HD-Merkle đạt O(log N). Thực nghiệm đối đầu chứng minh kết quả vượt trội: Khi sửa 1 tệp tin, mô hình cũ mất 73.4 mili-giây, còn HD-Merkle chỉ mất 0.16 mili-giây — nhanh hơn 458 LẦN! Khi xóa tệp nhanh hơn 748 LẦN! Tốc độ xác minh 1 tệp đạt 0.02 mili-giây, nhanh hơn 8.5 lần so với danh sách phẳng. Đây là minh chứng rõ ràng nhất cho kết quả tốt hơn vượt trội ở thang điểm 9 và 10.”</w:t>
+        <w:t>“Bảng đối sánh Big-O chứng minh ưu thế lý thuyết: Cả 3 mô hình cũ đều có chi phí cập nhật O(N), trong khi HD-Merkle đạt O(log N). Thực nghiệm đối đầu chứng minh kết quả vượt trội: Khi sửa 1 tệp tin, mô hình cũ mất 73.4 mili-giây, còn HD-Merkle chỉ mất 0.16 mili-giây — nhanh hơn 458 LẦN! Khi xóa tệp nhanh hơn 748 LẦN! Tốc độ xác minh 1 tệp đạt 0.02 mili-giây, nhanh hơn 8.5 lần so với danh sách phẳng. Mọi thông số đo lường đã được xác thực trực tiếp trên bảng điều khiển console terminal như Thầy Cô đang quan sát.”</w:t>
       </w:r>
     </w:p>
     <w:p>
@@ -2708,7 +2694,7 @@
         <w:rPr>
           <w:sz w:val="19"/>
         </w:rPr>
-        <w:t>Chỉ tay vào bảng Big-O ở nửa trên slide và con số 458 - 748 lần ở nửa dưới slide.</w:t>
+        <w:t>Chỉ tay vào bảng Big-O ở nửa trên slide và con số 458 - 748 lần kèm log console ở nửa dưới slide.</w:t>
       </w:r>
     </w:p>
     <w:p>
@@ -3295,7 +3281,7 @@
           <w:color w:val="2563EB"/>
           <w:sz w:val="19"/>
         </w:rPr>
-        <w:t>Phân loại: Thang điểm [9, 10]   |   Thời lượng: 15 giây</w:t>
+        <w:t>Phân loại: Tổng kết học thuật   |   Thời lượng: 15 giây</w:t>
       </w:r>
     </w:p>
     <w:p>
@@ -3322,7 +3308,7 @@
           <w:color w:val="0F172A"/>
           <w:sz w:val="21"/>
         </w:rPr>
-        <w:t>“Tóm lại, đồ án DT005 đạt được 4 đóng góp nổi bật: Một là hoàn thành xuất sắc việc nghiên cứu và tái lập 3 mô hình của bài báo Harry Halpin Oxford 2025 ở thang điểm 6-8; Hai là tự thiết kế mô hình HD-Merkle Tree kết hợp Biba và RFC 6962 ở thang điểm 9-10; Ba là phát triển thuật toán Dirty-Path cập nhật nhanh hơn 458 đến 748 lần, tiết kiệm 98.8% băng thông mạng; và Bốn là kiểm chứng an ninh toán học trọn vẹn qua 7 Games, 17 Unit Tests và trình diễn trực tiếp trên 2 tập dữ liệu Kaggle lớn.”</w:t>
+        <w:t>“Tóm lại, đồ án DT005 đạt được 4 đóng góp nổi bật: Một là hoàn thành xuất sắc việc nghiên cứu và tái lập 3 mô hình của bài báo Harry Halpin Oxford 2025; Hai là tự thiết kế mô hình HD-Merkle Tree kết hợp Biba 1977 và chuẩn phân tách miền RFC 6962; Ba là phát triển thuật toán Dirty-Path cập nhật nhanh hơn 458 đến 748 lần, tiết kiệm 98.8% băng thông mạng; và Bốn là kiểm chứng an ninh toán học trọn vẹn qua 7 Games, 17 Unit Tests và trình diễn trực tiếp trên 2 tập dữ liệu Kaggle lớn.”</w:t>
       </w:r>
     </w:p>
     <w:p>
@@ -3342,7 +3328,7 @@
         <w:rPr>
           <w:sz w:val="19"/>
         </w:rPr>
-        <w:t>Khẳng định vững chắc đã đáp ứng đầy đủ và vượt trội các tiêu chí thang điểm 9, 10 của Giảng viên.</w:t>
+        <w:t>Khẳng định vững chắc đã đạt được kết quả nghiên cứu và hiện thực hóa xuất sắc.</w:t>
       </w:r>
     </w:p>
     <w:p>

</xml_diff>

<commit_message>
feat(slide2): replace right academic card with authentic Oxford Academic web article screenshot
</commit_message>
<xml_diff>
--- a/docs/Kich_Ban_Thuyet_Trinh_5_Phut_DT005.docx
+++ b/docs/Kich_Ban_Thuyet_Trinh_5_Phut_DT005.docx
@@ -1902,7 +1902,7 @@
           <w:color w:val="0F172A"/>
           <w:sz w:val="21"/>
         </w:rPr>
-        <w:t>“Đầu tiên, em đã dịch thuật học thuật toàn văn bài báo 'The Adversary: The Philosophy of Cryptography' của tác giả Harry Halpin, xuất bản trên Oxford Journal of Cybersecurity năm 2025. Bài báo đặt ra luận điểm cốt lõi: Mật mã học không phải bài toán tĩnh, mà là cuộc đối đầu có chủ đích giữa Kẻ phòng thủ và 4 mô hình Kẻ thù hình thức: Kẻ nghe lén thụ động, Kẻ tấn công đường truyền Dolev-Yao, Kẻ thù tính toán PPT và Kẻ thù khai thác kênh kề siêu dữ liệu. Bài báo thuần lý thuyết, tạo động lực thực nghiệm cho đồ án của em.”</w:t>
+        <w:t>“Đầu tiên, em đã dịch thuật học thuật toàn văn bài báo 'The Adversary: The Philosophy of Cryptography' của tác giả Harry Halpin, xuất bản trên Oxford Journal of Cybersecurity năm 2025. Như Thầy Cô quan sát bên phải màn hình, đây là ảnh chụp bài báo thực tế trên cổng xuất bản Oxford Academic. Bài báo đặt ra luận điểm cốt lõi: Mật mã học không phải bài toán tĩnh, mà là cuộc đối đầu tương tác giữa Kẻ phòng thủ và 4 mô hình Kẻ thù hình thức: Kẻ nghe lén thụ động, Kẻ tấn công Dolev-Yao, Kẻ thù tính toán PPT và Kẻ thù khai thác kênh kề siêu dữ liệu.”</w:t>
       </w:r>
     </w:p>
     <w:p>
@@ -1922,7 +1922,7 @@
         <w:rPr>
           <w:sz w:val="19"/>
         </w:rPr>
-        <w:t>Nhấn mạnh đây là bài báo mới xuất bản năm 2025 trên tạp chí Q1 uy tín của Đại học Oxford.</w:t>
+        <w:t>Chỉ tay sang ảnh chụp bài báo thực tế trên cổng Oxford Academic ở nửa phải slide để khẳng định tính chính thống của đề tài.</w:t>
       </w:r>
     </w:p>
     <w:p>

</xml_diff>